<commit_message>
docs: make commit-count wording future-proof in progress report
</commit_message>
<xml_diff>
--- a/进度报告一.docx
+++ b/进度报告一.docx
@@ -968,7 +968,7 @@
           <w:b w:val="0"/>
           <w:sz w:val="20"/>
         </w:rPr>
-        <w:t>④ 仓库首次提交与远程推送：lecture1 分支共 7 次语义化提交并已推送 GitHub，仓库页面可查（证据：八-图6）。</w:t>
+        <w:t>④ 仓库首次提交与远程推送：lecture1 分支多次语义化提交已全部推送 GitHub，仓库页面可查（证据：八-图6）。</w:t>
       </w:r>
     </w:p>
     <w:p>
@@ -978,7 +978,7 @@
           <w:b w:val="0"/>
           <w:sz w:val="20"/>
         </w:rPr>
-        <w:t>⑤ Git 提交规范：全部提交说明语义化（feat/docs），build/ 等垃圾文件已被 .gitignore 排除，仓库根含 README（证据：八-图6 文件列表）。</w:t>
+        <w:t>⑤ Git 提交规范：提交说明全部语义化（feat/docs），build/ 等垃圾文件已被 .gitignore 排除，仓库根含 README（证据：八-图6 文件列表）。</w:t>
       </w:r>
     </w:p>
     <w:p>
@@ -1981,7 +1981,7 @@
           <w:b w:val="0"/>
           <w:sz w:val="18"/>
         </w:rPr>
-        <w:t>图6 GitHub 仓库页面：lecture1 分支 7 次提交、文件列表与 README 渲染（全屏）</w:t>
+        <w:t>图6 GitHub 仓库页面：lecture1 分支、文件列表与 README 渲染（全屏）</w:t>
       </w:r>
     </w:p>
     <w:p>
@@ -2043,7 +2043,7 @@
           <w:rFonts w:ascii="Calibri" w:hAnsi="Calibri" w:eastAsia="微软雅黑"/>
           <w:sz w:val="21"/>
         </w:rPr>
-        <w:t>Git 提交规范：7 次提交全部语义化（feat/docs），.gitignore 排除 build/ 等垃圾文件 ✓</w:t>
+        <w:t>Git 提交规范：提交说明全部语义化（feat/docs），.gitignore 排除 build/ 等垃圾文件 ✓</w:t>
       </w:r>
     </w:p>
     <w:p>

</xml_diff>